<commit_message>
Add round-two art requests: model reference sheets before modelling
Every model now has a reference sheet to be generated first: a turnaround
per species and commander, a kit sheet per region at Hopper's scale, a
props sheet and a pose sheet for Hopper's new clips. They are a separate
round-two document so round one, already in production, is unchanged
apart from a pointer. The manifest records rounds and each model's
references; the design document's asset plan is updated.

Co-Authored-By: Claude Fable 5.1 <noreply@anthropic.com>
Claude-Session: https://claude.ai/code/session_01XxoFBNcbz8v1DzJTELYzxk
</commit_message>
<xml_diff>
--- a/hopper/3d/design/Hopper_3D_Design.docx
+++ b/hopper/3d/design/Hopper_3D_Design.docx
@@ -15490,7 +15490,16 @@
         <w:t>image-requests.md</w:t>
       </w:r>
       <w:r>
-        <w:t xml:space="preserve"> (47 images and textures), both generated from </w:t>
+        <w:t xml:space="preserve"> (47 images and textures, round one) and </w:t>
+      </w:r>
+      <w:r>
+        <w:rPr>
+          <w:rFonts w:ascii="Consolas" w:hAnsi="Consolas"/>
+        </w:rPr>
+        <w:t>image-requests-round-2.md</w:t>
+      </w:r>
+      <w:r>
+        <w:t xml:space="preserve"> (32 model reference sheets, round two), both generated from </w:t>
       </w:r>
       <w:r>
         <w:rPr>
@@ -16364,7 +16373,7 @@
                 <w:color w:val="111111"/>
                 <w:sz w:val="20"/>
               </w:rPr>
-              <w:t>Interface and effects images</w:t>
+              <w:t>Reference sheets (turnarounds, kit sheets, props, Hopper poses)</w:t>
             </w:r>
           </w:p>
         </w:tc>
@@ -16396,6 +16405,107 @@
                 <w:color w:val="111111"/>
                 <w:sz w:val="20"/>
               </w:rPr>
+              <w:t>32</w:t>
+            </w:r>
+          </w:p>
+        </w:tc>
+        <w:tc>
+          <w:tcPr>
+            <w:tcW w:type="dxa" w:w="3730"/>
+            <w:vAlign w:val="center"/>
+            <w:shd w:fill="F2F4F7"/>
+            <w:tcBorders>
+              <w:top w:val="single" w:sz="4" w:color="D9D9D9"/>
+              <w:left w:val="single" w:sz="4" w:color="D9D9D9"/>
+              <w:bottom w:val="single" w:sz="4" w:color="D9D9D9"/>
+              <w:right w:val="single" w:sz="4" w:color="D9D9D9"/>
+            </w:tcBorders>
+            <w:tcMar>
+              <w:top w:w="80" w:type="dxa"/>
+              <w:bottom w:w="80" w:type="dxa"/>
+              <w:left w:w="100" w:type="dxa"/>
+              <w:right w:w="100" w:type="dxa"/>
+            </w:tcMar>
+          </w:tcPr>
+          <w:p>
+            <w:pPr>
+              <w:spacing w:after="0" w:line="245" w:lineRule="auto"/>
+            </w:pPr>
+            <w:r>
+              <w:rPr>
+                <w:b w:val="0"/>
+                <w:color w:val="111111"/>
+                <w:sz w:val="20"/>
+              </w:rPr>
+              <w:t>Open; generated before the models they describe</w:t>
+            </w:r>
+          </w:p>
+        </w:tc>
+      </w:tr>
+      <w:tr>
+        <w:trPr>
+          <w:cantSplit/>
+        </w:trPr>
+        <w:tc>
+          <w:tcPr>
+            <w:tcW w:type="dxa" w:w="3096"/>
+            <w:vAlign w:val="center"/>
+            <w:shd w:fill="FFFFFF"/>
+            <w:tcBorders>
+              <w:top w:val="single" w:sz="4" w:color="D9D9D9"/>
+              <w:left w:val="single" w:sz="4" w:color="D9D9D9"/>
+              <w:bottom w:val="single" w:sz="4" w:color="D9D9D9"/>
+              <w:right w:val="single" w:sz="4" w:color="D9D9D9"/>
+            </w:tcBorders>
+            <w:tcMar>
+              <w:top w:w="80" w:type="dxa"/>
+              <w:bottom w:w="80" w:type="dxa"/>
+              <w:left w:w="100" w:type="dxa"/>
+              <w:right w:w="100" w:type="dxa"/>
+            </w:tcMar>
+          </w:tcPr>
+          <w:p>
+            <w:pPr>
+              <w:spacing w:after="0" w:line="245" w:lineRule="auto"/>
+            </w:pPr>
+            <w:r>
+              <w:rPr>
+                <w:b w:val="0"/>
+                <w:color w:val="111111"/>
+                <w:sz w:val="20"/>
+              </w:rPr>
+              <w:t>Interface and effects images</w:t>
+            </w:r>
+          </w:p>
+        </w:tc>
+        <w:tc>
+          <w:tcPr>
+            <w:tcW w:type="dxa" w:w="3456"/>
+            <w:vAlign w:val="center"/>
+            <w:shd w:fill="FFFFFF"/>
+            <w:tcBorders>
+              <w:top w:val="single" w:sz="4" w:color="D9D9D9"/>
+              <w:left w:val="single" w:sz="4" w:color="D9D9D9"/>
+              <w:bottom w:val="single" w:sz="4" w:color="D9D9D9"/>
+              <w:right w:val="single" w:sz="4" w:color="D9D9D9"/>
+            </w:tcBorders>
+            <w:tcMar>
+              <w:top w:w="80" w:type="dxa"/>
+              <w:bottom w:w="80" w:type="dxa"/>
+              <w:left w:w="100" w:type="dxa"/>
+              <w:right w:w="100" w:type="dxa"/>
+            </w:tcMar>
+          </w:tcPr>
+          <w:p>
+            <w:pPr>
+              <w:spacing w:after="0" w:line="245" w:lineRule="auto"/>
+            </w:pPr>
+            <w:r>
+              <w:rPr>
+                <w:b w:val="0"/>
+                <w:color w:val="111111"/>
+                <w:sz w:val="20"/>
+              </w:rPr>
               <w:t>11</w:t>
             </w:r>
           </w:p>
@@ -16404,7 +16514,7 @@
           <w:tcPr>
             <w:tcW w:type="dxa" w:w="3730"/>
             <w:vAlign w:val="center"/>
-            <w:shd w:fill="F2F4F7"/>
+            <w:shd w:fill="FFFFFF"/>
             <w:tcBorders>
               <w:top w:val="single" w:sz="4" w:color="D9D9D9"/>
               <w:left w:val="single" w:sz="4" w:color="D9D9D9"/>
@@ -16553,12 +16663,34 @@
         <w:pStyle w:val="Heading2"/>
       </w:pPr>
       <w:r>
+        <w:t>References before models</w:t>
+      </w:r>
+    </w:p>
+    <w:p>
+      <w:r>
+        <w:t xml:space="preserve">No model is started from a single side-view sprite. Every model request names the art it must match and a reference sheet that is generated and approved first: a turnaround for each species and commander, a kit sheet per region drawn at a shared scale with Hopper, a props sheet, and a pose sheet for Hopper's new clips. These are the second round of image requests, </w:t>
+      </w:r>
+      <w:r>
+        <w:rPr>
+          <w:rFonts w:ascii="Consolas" w:hAnsi="Consolas"/>
+        </w:rPr>
+        <w:t>image-requests-round-2.md</w:t>
+      </w:r>
+      <w:r>
+        <w:t>, added after the first round had begun; it maps every sheet to the models that wait on it.</w:t>
+      </w:r>
+    </w:p>
+    <w:p>
+      <w:pPr>
+        <w:pStyle w:val="Heading2"/>
+      </w:pPr>
+      <w:r>
         <w:t>Order of arrival</w:t>
       </w:r>
     </w:p>
     <w:p>
       <w:r>
-        <w:t>Art can arrive in any order because the stand-ins hold every slot, but the order that helps most is: the Hopper clips (glide and dive change how the game feels), the four mission-one species, the Sunseed and Crownline kits and skies, the Night Rook, then the rest by mission. Paintings should be checked in the viewer against the stand-in they replace before they are committed.</w:t>
+        <w:t>Art can arrive in any order because the stand-ins hold every slot, but the order that helps most is: the reference sheets for mission one, the Hopper clips (glide and dive change how the game feels), the four mission-one species, the Sunseed and Crownline kits and skies, the Night Rook, then the rest by mission. Paintings should be checked in the viewer against the stand-in they replace before they are committed.</w:t>
       </w:r>
     </w:p>
     <w:p>

</xml_diff>